<commit_message>
cap nhat muc luc bao cao do an
</commit_message>
<xml_diff>
--- a/211200969_NguyenDanhTruong_KSCNTT2.docx
+++ b/211200969_NguyenDanhTruong_KSCNTT2.docx
@@ -256,21 +256,42 @@
           <w:i/>
           <w:iCs/>
         </w:rPr>
-        <w:t>Hà Nội, ngày    tháng    năm 20</w:t>
+        <w:t xml:space="preserve">Hà Nội, ngày  </w:t>
       </w:r>
       <w:r>
         <w:rPr>
           <w:i/>
           <w:iCs/>
         </w:rPr>
-        <w:t>.</w:t>
+        <w:t>8</w:t>
       </w:r>
       <w:r>
         <w:rPr>
           <w:i/>
           <w:iCs/>
         </w:rPr>
-        <w:t>..</w:t>
+        <w:t xml:space="preserve"> tháng  </w:t>
+      </w:r>
+      <w:r>
+        <w:rPr>
+          <w:i/>
+          <w:iCs/>
+        </w:rPr>
+        <w:t>3</w:t>
+      </w:r>
+      <w:r>
+        <w:rPr>
+          <w:i/>
+          <w:iCs/>
+        </w:rPr>
+        <w:t xml:space="preserve"> năm 20</w:t>
+      </w:r>
+      <w:r>
+        <w:rPr>
+          <w:i/>
+          <w:iCs/>
+        </w:rPr>
+        <w:t>26</w:t>
       </w:r>
     </w:p>
     <w:p>
@@ -758,7 +779,7 @@
           <w:b/>
           <w:bCs/>
         </w:rPr>
-        <w:t>100% bằng giọng nói tiếng Việ</w:t>
+        <w:t>bằng giọng nói tiếng Việ</w:t>
       </w:r>
       <w:r>
         <w:rPr>
@@ -768,7 +789,7 @@
         <w:t>t</w:t>
       </w:r>
       <w:r>
-        <w:t>, thay thế hoàn toàn các thao tác chuột/phím truyền thống. Hệ thống đạt độ trễ xử lý lệnh dưới 1 giây và độ chính xác nhận diện trên 90% trong môi trường yên tĩnh.</w:t>
+        <w:t>, thay thế các thao tác chuột/phím truyền thống. Hệ thống đạt độ trễ xử lý lệnh dưới 1 giây và độ chính xác nhận diện trên 90% trong môi trường yên tĩnh.</w:t>
       </w:r>
     </w:p>
     <w:p>
@@ -3388,6 +3409,7 @@
   <w:style w:type="character" w:default="1" w:styleId="DefaultParagraphFont">
     <w:name w:val="Default Paragraph Font"/>
     <w:uiPriority w:val="1"/>
+    <w:semiHidden/>
     <w:unhideWhenUsed/>
   </w:style>
   <w:style w:type="table" w:default="1" w:styleId="TableNormal">

</xml_diff>